<commit_message>
Makalenin amacı ve araştırma soruları eklendi
Ana başlık “Makalenin Konusu, Amacı ve Araştırma Soruları” olarak güncellendi.
Başlıklara numaralandırma eklendi.
1.4 Makalenin Amacı bölümü yazıldı.
1.5 Araştırma Soruları bölümü yazıldı.
</commit_message>
<xml_diff>
--- a/Makale_Inceleme_Raporu.docx
+++ b/Makale_Inceleme_Raporu.docx
@@ -410,7 +410,7 @@
       </w:pPr>
       <w:r>
         <w:lastRenderedPageBreak/>
-        <w:t>Makalenin Temel Konusu ve Problem Tanımı</w:t>
+        <w:t>1. Makalenin Konusu, Amacı ve Araştırma Soruları</w:t>
       </w:r>
     </w:p>
     <w:p>
@@ -420,7 +420,7 @@
         <w:spacing w:before="200" w:after="100"/>
       </w:pPr>
       <w:r>
-        <w:t>Makale Künyesi</w:t>
+        <w:t>1.1. Makale Künyesi</w:t>
       </w:r>
     </w:p>
     <w:tbl>
@@ -1232,7 +1232,7 @@
         <w:spacing w:before="200" w:after="100"/>
       </w:pPr>
       <w:r>
-        <w:t>Makalenin Konusu</w:t>
+        <w:t>1.2. Makalenin Konusu</w:t>
       </w:r>
     </w:p>
     <w:p>
@@ -1297,7 +1297,7 @@
         <w:spacing w:before="200" w:after="100"/>
       </w:pPr>
       <w:r>
-        <w:t>Makalenin Ele Aldığı Problem</w:t>
+        <w:t>1.3. Makalenin Ele Aldığı Problem</w:t>
       </w:r>
     </w:p>
     <w:p>
@@ -1346,14 +1346,9 @@
       <w:r>
         <w:t xml:space="preserve"> ise nesnenin durumuna göre davranışının değişmesine dayanır. Bu nedenle yalnızca sınıf ilişkilerine bakmak, bu iki deseni ayırmak için yeterli olmamaktadır [1]. Statik analiz yapısal ilişkileri, dinamik analiz ise çalışma sırasındaki </w:t>
       </w:r>
-      <w:proofErr w:type="gramStart"/>
       <w:r>
         <w:lastRenderedPageBreak/>
-        <w:t>etkileşimleri</w:t>
-      </w:r>
-      <w:proofErr w:type="gramEnd"/>
-      <w:r>
-        <w:t xml:space="preserve"> gösterir. İkisinin birlikte kullanılması, yapısal benzerliğin arkasındaki davranış farkını değerlendirmeyi sağlar.</w:t>
+        <w:t>etkileşimleri gösterir. İkisinin birlikte kullanılması, yapısal benzerliğin arkasındaki davranış farkını değerlendirmeyi sağlar.</w:t>
       </w:r>
     </w:p>
     <w:p>
@@ -1363,6 +1358,119 @@
       </w:pPr>
       <w:r>
         <w:t>Çalışmanın temel problemi, tasarım desenlerini sınıf veya metot adlarını önceden sabitlemeden, yapısal ve davranışsal ilişkiler üzerinden tespit etmektir [1]. Ancak sonuçlar incelenen yürütme izine bağlıdır. Örneğin seçilen senaryoda bir durum geçişi gerçekleşmezse ilgili etkileşimler izde görünmez. Bu yüzden bir desenin tespit edilememesi, programda bulunmadığını kesin olarak göstermez. Farklı kullanım senaryolarının incelenmesi bu eksikliği azaltabilir.</w:t>
+      </w:r>
+    </w:p>
+    <w:p>
+      <w:pPr>
+        <w:pStyle w:val="Balk2"/>
+        <w:keepNext/>
+        <w:spacing w:before="200" w:after="100"/>
+      </w:pPr>
+      <w:r>
+        <w:t>1.4. Makalenin Amacı</w:t>
+      </w:r>
+    </w:p>
+    <w:p>
+      <w:pPr>
+        <w:spacing w:after="140" w:line="360" w:lineRule="auto"/>
+        <w:jc w:val="both"/>
+      </w:pPr>
+      <w:r>
+        <w:t>Mohan ve arkadaşları, Java programlarında kullanılan tasarım desenlerini otomatik olarak tespit etmek için yeni bir yöntem önermektedir. Çalışmada, tasarım desenlerini belirli sınıf veya metot isimlerine bağlı kalmadan, nesneler arasındaki yapısal ve davranışsal ilişkiler üzerinden belirlemek amaçlanmaktadır [1].</w:t>
+      </w:r>
+    </w:p>
+    <w:p>
+      <w:pPr>
+        <w:spacing w:after="140" w:line="360" w:lineRule="auto"/>
+        <w:jc w:val="both"/>
+      </w:pPr>
+      <w:r>
+        <w:t>Yazarlar, geliştirdikleri yöntemin farklı Java programlarında</w:t>
+      </w:r>
+      <w:r>
+        <w:t xml:space="preserve"> </w:t>
+      </w:r>
+      <w:r>
+        <w:t>da kullanılabilmesini hedeflemektedir. Bu doğrultuda, önerilen yaklaşımın farklı tasarım desenlerini tespit etmedeki başarısı incelenmektedir.</w:t>
+      </w:r>
+    </w:p>
+    <w:p>
+      <w:pPr>
+        <w:pStyle w:val="Balk2"/>
+        <w:keepNext/>
+        <w:spacing w:before="200" w:after="100"/>
+      </w:pPr>
+      <w:r>
+        <w:t>1.5. Araştırma Soruları</w:t>
+      </w:r>
+    </w:p>
+    <w:p>
+      <w:pPr>
+        <w:spacing w:after="140" w:line="360" w:lineRule="auto"/>
+        <w:jc w:val="both"/>
+      </w:pPr>
+      <w:r>
+        <w:t xml:space="preserve">Makalede araştırma soruları ayrı bir başlık altında belirtilmemiştir. Ancak çalışmanın amacı ve yapılan deneyler üzerinden şu soruların </w:t>
+      </w:r>
+      <w:r>
+        <w:t>araştırıldığını</w:t>
+      </w:r>
+      <w:r>
+        <w:t xml:space="preserve"> söyle</w:t>
+      </w:r>
+      <w:r>
+        <w:t>ye</w:t>
+      </w:r>
+      <w:r>
+        <w:t>bilir</w:t>
+      </w:r>
+      <w:r>
+        <w:t>im</w:t>
+      </w:r>
+      <w:r>
+        <w:t>:</w:t>
+      </w:r>
+    </w:p>
+    <w:p>
+      <w:pPr>
+        <w:spacing w:after="140" w:line="360" w:lineRule="auto"/>
+        <w:ind w:left="567" w:hanging="283"/>
+        <w:jc w:val="both"/>
+      </w:pPr>
+      <w:r>
+        <w:t>1.</w:t>
+      </w:r>
+      <w:r>
+        <w:tab/>
+        <w:t>Tasarım desenleri, sınıf ve metot isimlerine bağlı kalmadan nesneler arasındaki ilişkiler üzerinden tanımlanabilir mi?</w:t>
+      </w:r>
+    </w:p>
+    <w:p>
+      <w:pPr>
+        <w:spacing w:after="140" w:line="360" w:lineRule="auto"/>
+        <w:ind w:left="567" w:hanging="283"/>
+        <w:jc w:val="both"/>
+      </w:pPr>
+      <w:r>
+        <w:t>2.</w:t>
+      </w:r>
+      <w:r>
+        <w:tab/>
+        <w:t>Önerilen yöntem, farklı Java programlarında tasarım desenlerini ne kadar başarılı tespit edebilmektedir?</w:t>
+      </w:r>
+    </w:p>
+    <w:p>
+      <w:pPr>
+        <w:spacing w:after="140" w:line="360" w:lineRule="auto"/>
+        <w:ind w:left="567" w:hanging="283"/>
+        <w:jc w:val="both"/>
+      </w:pPr>
+      <w:r>
+        <w:t>3.</w:t>
+      </w:r>
+      <w:r>
+        <w:tab/>
+        <w:t>Geliştirilen yaklaşımın mevcut tasarım deseni tespit yöntemlerine göre avantajları ve sınırlılıkları nelerdir?</w:t>
       </w:r>
     </w:p>
     <w:p>

</xml_diff>